<commit_message>
test(corpus): Word's runs of formatting for the committed references
The maintainer's Word run of 2026-10-14 read the formatting of the 81
documents of the K2 run again with make-reference.ps1 -FormattingOnly, and
rendered the 15 rule documents of the first run again with the formatting
export. Imported with corpus-import.py:

- 47 references: formatting.json now has style_builtin, the theme colour
  names, and for 36 of them the runs of formatting (11 stay without runs:
  Word took longer for them than for the paragraphs). Rasters, geometry
  and re-saved copies are unchanged.
- 15 rule documents of the first run: a formatting.json each for the
  first time. The new PDFs rasterize to the same PNG files and give the
  same geometry; only the PDF's SHA-256 changes.

SOURCES.md's introduction now describes formatting.json and the notes on
dropped w:compat settings and on the formatting.

Co-Authored-By: Claude Opus 5.5 <noreply@anthropic.com>
</commit_message>
<xml_diff>
--- a/tests/corpus/resaved/word-rules/E-list-shared-abstract.docx
+++ b/tests/corpus/resaved/word-rules/E-list-shared-abstract.docx
@@ -171,7 +171,7 @@
   <w:abstractNum w:abstractNumId="0" w15:restartNumberingAfterBreak="0">
     <w:nsid w:val="5C3A0001"/>
     <w:multiLevelType w:val="multilevel"/>
-    <w:tmpl w:val="A984D886"/>
+    <w:tmpl w:val="5590FEA0"/>
     <w:lvl w:ilvl="0">
       <w:start w:val="1"/>
       <w:numFmt w:val="decimal"/>
@@ -240,22 +240,22 @@
       </w:pPr>
     </w:lvl>
   </w:abstractNum>
-  <w:num w:numId="1" w16cid:durableId="515078793">
+  <w:num w:numId="1" w16cid:durableId="2071339940">
     <w:abstractNumId w:val="0"/>
   </w:num>
-  <w:num w:numId="2" w16cid:durableId="1233585055">
+  <w:num w:numId="2" w16cid:durableId="426461397">
     <w:abstractNumId w:val="0"/>
   </w:num>
-  <w:num w:numId="3" w16cid:durableId="1339192560">
+  <w:num w:numId="3" w16cid:durableId="1365711071">
     <w:abstractNumId w:val="0"/>
     <w:lvlOverride w:ilvl="0">
       <w:startOverride w:val="1"/>
     </w:lvlOverride>
   </w:num>
-  <w:num w:numId="4" w16cid:durableId="1318994858">
+  <w:num w:numId="4" w16cid:durableId="1331760340">
     <w:abstractNumId w:val="1"/>
   </w:num>
-  <w:num w:numId="5" w16cid:durableId="390931203">
+  <w:num w:numId="5" w16cid:durableId="1767072566">
     <w:abstractNumId w:val="0"/>
     <w:lvlOverride w:ilvl="0">
       <w:startOverride w:val="10"/>

</xml_diff>